<commit_message>
Move Censorship's book details into the details tag
The bibliographic line was sitting as plain body text since the
document had no <details> tag. Added the tag around it directly in
the .docx so it now shows in the sidebar like the other pieces.

Co-Authored-By: Claude Sonnet 5 <noreply@anthropic.com>
Claude-Session: https://claude.ai/code/session_01NEiSPdGPQ5yu3jyGEnLrsy
</commit_message>
<xml_diff>
--- a/content-src/docx/R TLS 2002 02 05 Censorship.docx
+++ b/content-src/docx/R TLS 2002 02 05 Censorship.docx
@@ -45,6 +45,9 @@
         <w:spacing w:before="240" w:after="240"/>
       </w:pPr>
       <w:r>
+        <w:t>&lt;details&gt;</w:t>
+      </w:r>
+      <w:r>
         <w:rPr>
           <w:i/>
           <w:iCs/>
@@ -73,6 +76,9 @@
       </w:r>
       <w:r>
         <w:t xml:space="preserve"> Four volumes, 2,891 pp. Fitzroy Dearborn. £265. 1 57958 135 8</w:t>
+      </w:r>
+      <w:r>
+        <w:t>&lt;/details&gt;</w:t>
       </w:r>
     </w:p>
     <w:p>

</xml_diff>